<commit_message>
Update samples and README - 22896650137
</commit_message>
<xml_diff>
--- a/samples/test_docx.docx
+++ b/samples/test_docx.docx
@@ -425,7 +425,7 @@
     <w:link w:val="Heading1Char"/>
     <w:uiPriority w:val="9"/>
     <w:qFormat/>
-    <w:rsid w:val="00FA68B3"/>
+    <w:rsid w:val="00CE097D"/>
     <w:pPr>
       <w:keepNext/>
       <w:keepLines/>
@@ -448,7 +448,7 @@
     <w:semiHidden/>
     <w:unhideWhenUsed/>
     <w:qFormat/>
-    <w:rsid w:val="00FA68B3"/>
+    <w:rsid w:val="00CE097D"/>
     <w:pPr>
       <w:keepNext/>
       <w:keepLines/>
@@ -471,7 +471,7 @@
     <w:semiHidden/>
     <w:unhideWhenUsed/>
     <w:qFormat/>
-    <w:rsid w:val="00FA68B3"/>
+    <w:rsid w:val="00CE097D"/>
     <w:pPr>
       <w:keepNext/>
       <w:keepLines/>
@@ -494,7 +494,7 @@
     <w:semiHidden/>
     <w:unhideWhenUsed/>
     <w:qFormat/>
-    <w:rsid w:val="00FA68B3"/>
+    <w:rsid w:val="00CE097D"/>
     <w:pPr>
       <w:keepNext/>
       <w:keepLines/>
@@ -517,7 +517,7 @@
     <w:semiHidden/>
     <w:unhideWhenUsed/>
     <w:qFormat/>
-    <w:rsid w:val="00FA68B3"/>
+    <w:rsid w:val="00CE097D"/>
     <w:pPr>
       <w:keepNext/>
       <w:keepLines/>
@@ -538,7 +538,7 @@
     <w:semiHidden/>
     <w:unhideWhenUsed/>
     <w:qFormat/>
-    <w:rsid w:val="00FA68B3"/>
+    <w:rsid w:val="00CE097D"/>
     <w:pPr>
       <w:keepNext/>
       <w:keepLines/>
@@ -561,7 +561,7 @@
     <w:semiHidden/>
     <w:unhideWhenUsed/>
     <w:qFormat/>
-    <w:rsid w:val="00FA68B3"/>
+    <w:rsid w:val="00CE097D"/>
     <w:pPr>
       <w:keepNext/>
       <w:keepLines/>
@@ -582,7 +582,7 @@
     <w:semiHidden/>
     <w:unhideWhenUsed/>
     <w:qFormat/>
-    <w:rsid w:val="00FA68B3"/>
+    <w:rsid w:val="00CE097D"/>
     <w:pPr>
       <w:keepNext/>
       <w:keepLines/>
@@ -605,7 +605,7 @@
     <w:semiHidden/>
     <w:unhideWhenUsed/>
     <w:qFormat/>
-    <w:rsid w:val="00FA68B3"/>
+    <w:rsid w:val="00CE097D"/>
     <w:pPr>
       <w:keepNext/>
       <w:keepLines/>
@@ -649,7 +649,7 @@
     <w:basedOn w:val="DefaultParagraphFont"/>
     <w:link w:val="Heading1"/>
     <w:uiPriority w:val="9"/>
-    <w:rsid w:val="00FA68B3"/>
+    <w:rsid w:val="00CE097D"/>
     <w:rPr>
       <w:rFonts w:asciiTheme="majorHAnsi" w:eastAsiaTheme="majorEastAsia" w:hAnsiTheme="majorHAnsi" w:cstheme="majorBidi"/>
       <w:color w:val="0F4761" w:themeColor="accent1" w:themeShade="BF"/>
@@ -663,7 +663,7 @@
     <w:link w:val="Heading2"/>
     <w:uiPriority w:val="9"/>
     <w:semiHidden/>
-    <w:rsid w:val="00FA68B3"/>
+    <w:rsid w:val="00CE097D"/>
     <w:rPr>
       <w:rFonts w:asciiTheme="majorHAnsi" w:eastAsiaTheme="majorEastAsia" w:hAnsiTheme="majorHAnsi" w:cstheme="majorBidi"/>
       <w:color w:val="0F4761" w:themeColor="accent1" w:themeShade="BF"/>
@@ -677,7 +677,7 @@
     <w:link w:val="Heading3"/>
     <w:uiPriority w:val="9"/>
     <w:semiHidden/>
-    <w:rsid w:val="00FA68B3"/>
+    <w:rsid w:val="00CE097D"/>
     <w:rPr>
       <w:rFonts w:eastAsiaTheme="majorEastAsia" w:cstheme="majorBidi"/>
       <w:color w:val="0F4761" w:themeColor="accent1" w:themeShade="BF"/>
@@ -691,7 +691,7 @@
     <w:link w:val="Heading4"/>
     <w:uiPriority w:val="9"/>
     <w:semiHidden/>
-    <w:rsid w:val="00FA68B3"/>
+    <w:rsid w:val="00CE097D"/>
     <w:rPr>
       <w:rFonts w:eastAsiaTheme="majorEastAsia" w:cstheme="majorBidi"/>
       <w:i/>
@@ -705,7 +705,7 @@
     <w:link w:val="Heading5"/>
     <w:uiPriority w:val="9"/>
     <w:semiHidden/>
-    <w:rsid w:val="00FA68B3"/>
+    <w:rsid w:val="00CE097D"/>
     <w:rPr>
       <w:rFonts w:eastAsiaTheme="majorEastAsia" w:cstheme="majorBidi"/>
       <w:color w:val="0F4761" w:themeColor="accent1" w:themeShade="BF"/>
@@ -717,7 +717,7 @@
     <w:link w:val="Heading6"/>
     <w:uiPriority w:val="9"/>
     <w:semiHidden/>
-    <w:rsid w:val="00FA68B3"/>
+    <w:rsid w:val="00CE097D"/>
     <w:rPr>
       <w:rFonts w:eastAsiaTheme="majorEastAsia" w:cstheme="majorBidi"/>
       <w:i/>
@@ -731,7 +731,7 @@
     <w:link w:val="Heading7"/>
     <w:uiPriority w:val="9"/>
     <w:semiHidden/>
-    <w:rsid w:val="00FA68B3"/>
+    <w:rsid w:val="00CE097D"/>
     <w:rPr>
       <w:rFonts w:eastAsiaTheme="majorEastAsia" w:cstheme="majorBidi"/>
       <w:color w:val="595959" w:themeColor="text1" w:themeTint="A6"/>
@@ -743,7 +743,7 @@
     <w:link w:val="Heading8"/>
     <w:uiPriority w:val="9"/>
     <w:semiHidden/>
-    <w:rsid w:val="00FA68B3"/>
+    <w:rsid w:val="00CE097D"/>
     <w:rPr>
       <w:rFonts w:eastAsiaTheme="majorEastAsia" w:cstheme="majorBidi"/>
       <w:i/>
@@ -757,7 +757,7 @@
     <w:link w:val="Heading9"/>
     <w:uiPriority w:val="9"/>
     <w:semiHidden/>
-    <w:rsid w:val="00FA68B3"/>
+    <w:rsid w:val="00CE097D"/>
     <w:rPr>
       <w:rFonts w:eastAsiaTheme="majorEastAsia" w:cstheme="majorBidi"/>
       <w:color w:val="272727" w:themeColor="text1" w:themeTint="D8"/>
@@ -770,7 +770,7 @@
     <w:link w:val="TitleChar"/>
     <w:uiPriority w:val="10"/>
     <w:qFormat/>
-    <w:rsid w:val="00FA68B3"/>
+    <w:rsid w:val="00CE097D"/>
     <w:pPr>
       <w:spacing w:after="80" w:line="240" w:lineRule="auto"/>
       <w:contextualSpacing/>
@@ -788,7 +788,7 @@
     <w:basedOn w:val="DefaultParagraphFont"/>
     <w:link w:val="Title"/>
     <w:uiPriority w:val="10"/>
-    <w:rsid w:val="00FA68B3"/>
+    <w:rsid w:val="00CE097D"/>
     <w:rPr>
       <w:rFonts w:asciiTheme="majorHAnsi" w:eastAsiaTheme="majorEastAsia" w:hAnsiTheme="majorHAnsi" w:cstheme="majorBidi"/>
       <w:spacing w:val="-10"/>
@@ -804,7 +804,7 @@
     <w:link w:val="SubtitleChar"/>
     <w:uiPriority w:val="11"/>
     <w:qFormat/>
-    <w:rsid w:val="00FA68B3"/>
+    <w:rsid w:val="00CE097D"/>
     <w:pPr>
       <w:numPr>
         <w:ilvl w:val="1"/>
@@ -823,7 +823,7 @@
     <w:basedOn w:val="DefaultParagraphFont"/>
     <w:link w:val="Subtitle"/>
     <w:uiPriority w:val="11"/>
-    <w:rsid w:val="00FA68B3"/>
+    <w:rsid w:val="00CE097D"/>
     <w:rPr>
       <w:rFonts w:eastAsiaTheme="majorEastAsia" w:cstheme="majorBidi"/>
       <w:color w:val="595959" w:themeColor="text1" w:themeTint="A6"/>
@@ -839,7 +839,7 @@
     <w:link w:val="QuoteChar"/>
     <w:uiPriority w:val="29"/>
     <w:qFormat/>
-    <w:rsid w:val="00FA68B3"/>
+    <w:rsid w:val="00CE097D"/>
     <w:pPr>
       <w:spacing w:before="160"/>
       <w:jc w:val="center"/>
@@ -855,7 +855,7 @@
     <w:basedOn w:val="DefaultParagraphFont"/>
     <w:link w:val="Quote"/>
     <w:uiPriority w:val="29"/>
-    <w:rsid w:val="00FA68B3"/>
+    <w:rsid w:val="00CE097D"/>
     <w:rPr>
       <w:i/>
       <w:iCs/>
@@ -867,7 +867,7 @@
     <w:basedOn w:val="Normal"/>
     <w:uiPriority w:val="34"/>
     <w:qFormat/>
-    <w:rsid w:val="00FA68B3"/>
+    <w:rsid w:val="00CE097D"/>
     <w:pPr>
       <w:ind w:left="720"/>
       <w:contextualSpacing/>
@@ -878,7 +878,7 @@
     <w:basedOn w:val="DefaultParagraphFont"/>
     <w:uiPriority w:val="21"/>
     <w:qFormat/>
-    <w:rsid w:val="00FA68B3"/>
+    <w:rsid w:val="00CE097D"/>
     <w:rPr>
       <w:i/>
       <w:iCs/>
@@ -892,7 +892,7 @@
     <w:link w:val="IntenseQuoteChar"/>
     <w:uiPriority w:val="30"/>
     <w:qFormat/>
-    <w:rsid w:val="00FA68B3"/>
+    <w:rsid w:val="00CE097D"/>
     <w:pPr>
       <w:pBdr>
         <w:top w:val="single" w:sz="4" w:space="10" w:color="0F4761" w:themeColor="accent1" w:themeShade="BF"/>
@@ -913,7 +913,7 @@
     <w:basedOn w:val="DefaultParagraphFont"/>
     <w:link w:val="IntenseQuote"/>
     <w:uiPriority w:val="30"/>
-    <w:rsid w:val="00FA68B3"/>
+    <w:rsid w:val="00CE097D"/>
     <w:rPr>
       <w:i/>
       <w:iCs/>
@@ -925,7 +925,7 @@
     <w:basedOn w:val="DefaultParagraphFont"/>
     <w:uiPriority w:val="32"/>
     <w:qFormat/>
-    <w:rsid w:val="00FA68B3"/>
+    <w:rsid w:val="00CE097D"/>
     <w:rPr>
       <w:b/>
       <w:bCs/>

</xml_diff>

<commit_message>
Update samples and README - 25075960254
</commit_message>
<xml_diff>
--- a/samples/test_docx.docx
+++ b/samples/test_docx.docx
@@ -425,7 +425,7 @@
     <w:link w:val="Heading1Char"/>
     <w:uiPriority w:val="9"/>
     <w:qFormat/>
-    <w:rsid w:val="00CE097D"/>
+    <w:rsid w:val="003621E6"/>
     <w:pPr>
       <w:keepNext/>
       <w:keepLines/>
@@ -448,7 +448,7 @@
     <w:semiHidden/>
     <w:unhideWhenUsed/>
     <w:qFormat/>
-    <w:rsid w:val="00CE097D"/>
+    <w:rsid w:val="003621E6"/>
     <w:pPr>
       <w:keepNext/>
       <w:keepLines/>
@@ -471,7 +471,7 @@
     <w:semiHidden/>
     <w:unhideWhenUsed/>
     <w:qFormat/>
-    <w:rsid w:val="00CE097D"/>
+    <w:rsid w:val="003621E6"/>
     <w:pPr>
       <w:keepNext/>
       <w:keepLines/>
@@ -494,7 +494,7 @@
     <w:semiHidden/>
     <w:unhideWhenUsed/>
     <w:qFormat/>
-    <w:rsid w:val="00CE097D"/>
+    <w:rsid w:val="003621E6"/>
     <w:pPr>
       <w:keepNext/>
       <w:keepLines/>
@@ -517,7 +517,7 @@
     <w:semiHidden/>
     <w:unhideWhenUsed/>
     <w:qFormat/>
-    <w:rsid w:val="00CE097D"/>
+    <w:rsid w:val="003621E6"/>
     <w:pPr>
       <w:keepNext/>
       <w:keepLines/>
@@ -538,7 +538,7 @@
     <w:semiHidden/>
     <w:unhideWhenUsed/>
     <w:qFormat/>
-    <w:rsid w:val="00CE097D"/>
+    <w:rsid w:val="003621E6"/>
     <w:pPr>
       <w:keepNext/>
       <w:keepLines/>
@@ -561,7 +561,7 @@
     <w:semiHidden/>
     <w:unhideWhenUsed/>
     <w:qFormat/>
-    <w:rsid w:val="00CE097D"/>
+    <w:rsid w:val="003621E6"/>
     <w:pPr>
       <w:keepNext/>
       <w:keepLines/>
@@ -582,7 +582,7 @@
     <w:semiHidden/>
     <w:unhideWhenUsed/>
     <w:qFormat/>
-    <w:rsid w:val="00CE097D"/>
+    <w:rsid w:val="003621E6"/>
     <w:pPr>
       <w:keepNext/>
       <w:keepLines/>
@@ -605,7 +605,7 @@
     <w:semiHidden/>
     <w:unhideWhenUsed/>
     <w:qFormat/>
-    <w:rsid w:val="00CE097D"/>
+    <w:rsid w:val="003621E6"/>
     <w:pPr>
       <w:keepNext/>
       <w:keepLines/>
@@ -649,7 +649,7 @@
     <w:basedOn w:val="DefaultParagraphFont"/>
     <w:link w:val="Heading1"/>
     <w:uiPriority w:val="9"/>
-    <w:rsid w:val="00CE097D"/>
+    <w:rsid w:val="003621E6"/>
     <w:rPr>
       <w:rFonts w:asciiTheme="majorHAnsi" w:eastAsiaTheme="majorEastAsia" w:hAnsiTheme="majorHAnsi" w:cstheme="majorBidi"/>
       <w:color w:val="0F4761" w:themeColor="accent1" w:themeShade="BF"/>
@@ -663,7 +663,7 @@
     <w:link w:val="Heading2"/>
     <w:uiPriority w:val="9"/>
     <w:semiHidden/>
-    <w:rsid w:val="00CE097D"/>
+    <w:rsid w:val="003621E6"/>
     <w:rPr>
       <w:rFonts w:asciiTheme="majorHAnsi" w:eastAsiaTheme="majorEastAsia" w:hAnsiTheme="majorHAnsi" w:cstheme="majorBidi"/>
       <w:color w:val="0F4761" w:themeColor="accent1" w:themeShade="BF"/>
@@ -677,7 +677,7 @@
     <w:link w:val="Heading3"/>
     <w:uiPriority w:val="9"/>
     <w:semiHidden/>
-    <w:rsid w:val="00CE097D"/>
+    <w:rsid w:val="003621E6"/>
     <w:rPr>
       <w:rFonts w:eastAsiaTheme="majorEastAsia" w:cstheme="majorBidi"/>
       <w:color w:val="0F4761" w:themeColor="accent1" w:themeShade="BF"/>
@@ -691,7 +691,7 @@
     <w:link w:val="Heading4"/>
     <w:uiPriority w:val="9"/>
     <w:semiHidden/>
-    <w:rsid w:val="00CE097D"/>
+    <w:rsid w:val="003621E6"/>
     <w:rPr>
       <w:rFonts w:eastAsiaTheme="majorEastAsia" w:cstheme="majorBidi"/>
       <w:i/>
@@ -705,7 +705,7 @@
     <w:link w:val="Heading5"/>
     <w:uiPriority w:val="9"/>
     <w:semiHidden/>
-    <w:rsid w:val="00CE097D"/>
+    <w:rsid w:val="003621E6"/>
     <w:rPr>
       <w:rFonts w:eastAsiaTheme="majorEastAsia" w:cstheme="majorBidi"/>
       <w:color w:val="0F4761" w:themeColor="accent1" w:themeShade="BF"/>
@@ -717,7 +717,7 @@
     <w:link w:val="Heading6"/>
     <w:uiPriority w:val="9"/>
     <w:semiHidden/>
-    <w:rsid w:val="00CE097D"/>
+    <w:rsid w:val="003621E6"/>
     <w:rPr>
       <w:rFonts w:eastAsiaTheme="majorEastAsia" w:cstheme="majorBidi"/>
       <w:i/>
@@ -731,7 +731,7 @@
     <w:link w:val="Heading7"/>
     <w:uiPriority w:val="9"/>
     <w:semiHidden/>
-    <w:rsid w:val="00CE097D"/>
+    <w:rsid w:val="003621E6"/>
     <w:rPr>
       <w:rFonts w:eastAsiaTheme="majorEastAsia" w:cstheme="majorBidi"/>
       <w:color w:val="595959" w:themeColor="text1" w:themeTint="A6"/>
@@ -743,7 +743,7 @@
     <w:link w:val="Heading8"/>
     <w:uiPriority w:val="9"/>
     <w:semiHidden/>
-    <w:rsid w:val="00CE097D"/>
+    <w:rsid w:val="003621E6"/>
     <w:rPr>
       <w:rFonts w:eastAsiaTheme="majorEastAsia" w:cstheme="majorBidi"/>
       <w:i/>
@@ -757,7 +757,7 @@
     <w:link w:val="Heading9"/>
     <w:uiPriority w:val="9"/>
     <w:semiHidden/>
-    <w:rsid w:val="00CE097D"/>
+    <w:rsid w:val="003621E6"/>
     <w:rPr>
       <w:rFonts w:eastAsiaTheme="majorEastAsia" w:cstheme="majorBidi"/>
       <w:color w:val="272727" w:themeColor="text1" w:themeTint="D8"/>
@@ -770,7 +770,7 @@
     <w:link w:val="TitleChar"/>
     <w:uiPriority w:val="10"/>
     <w:qFormat/>
-    <w:rsid w:val="00CE097D"/>
+    <w:rsid w:val="003621E6"/>
     <w:pPr>
       <w:spacing w:after="80" w:line="240" w:lineRule="auto"/>
       <w:contextualSpacing/>
@@ -788,7 +788,7 @@
     <w:basedOn w:val="DefaultParagraphFont"/>
     <w:link w:val="Title"/>
     <w:uiPriority w:val="10"/>
-    <w:rsid w:val="00CE097D"/>
+    <w:rsid w:val="003621E6"/>
     <w:rPr>
       <w:rFonts w:asciiTheme="majorHAnsi" w:eastAsiaTheme="majorEastAsia" w:hAnsiTheme="majorHAnsi" w:cstheme="majorBidi"/>
       <w:spacing w:val="-10"/>
@@ -804,7 +804,7 @@
     <w:link w:val="SubtitleChar"/>
     <w:uiPriority w:val="11"/>
     <w:qFormat/>
-    <w:rsid w:val="00CE097D"/>
+    <w:rsid w:val="003621E6"/>
     <w:pPr>
       <w:numPr>
         <w:ilvl w:val="1"/>
@@ -823,7 +823,7 @@
     <w:basedOn w:val="DefaultParagraphFont"/>
     <w:link w:val="Subtitle"/>
     <w:uiPriority w:val="11"/>
-    <w:rsid w:val="00CE097D"/>
+    <w:rsid w:val="003621E6"/>
     <w:rPr>
       <w:rFonts w:eastAsiaTheme="majorEastAsia" w:cstheme="majorBidi"/>
       <w:color w:val="595959" w:themeColor="text1" w:themeTint="A6"/>
@@ -839,7 +839,7 @@
     <w:link w:val="QuoteChar"/>
     <w:uiPriority w:val="29"/>
     <w:qFormat/>
-    <w:rsid w:val="00CE097D"/>
+    <w:rsid w:val="003621E6"/>
     <w:pPr>
       <w:spacing w:before="160"/>
       <w:jc w:val="center"/>
@@ -855,7 +855,7 @@
     <w:basedOn w:val="DefaultParagraphFont"/>
     <w:link w:val="Quote"/>
     <w:uiPriority w:val="29"/>
-    <w:rsid w:val="00CE097D"/>
+    <w:rsid w:val="003621E6"/>
     <w:rPr>
       <w:i/>
       <w:iCs/>
@@ -867,7 +867,7 @@
     <w:basedOn w:val="Normal"/>
     <w:uiPriority w:val="34"/>
     <w:qFormat/>
-    <w:rsid w:val="00CE097D"/>
+    <w:rsid w:val="003621E6"/>
     <w:pPr>
       <w:ind w:left="720"/>
       <w:contextualSpacing/>
@@ -878,7 +878,7 @@
     <w:basedOn w:val="DefaultParagraphFont"/>
     <w:uiPriority w:val="21"/>
     <w:qFormat/>
-    <w:rsid w:val="00CE097D"/>
+    <w:rsid w:val="003621E6"/>
     <w:rPr>
       <w:i/>
       <w:iCs/>
@@ -892,7 +892,7 @@
     <w:link w:val="IntenseQuoteChar"/>
     <w:uiPriority w:val="30"/>
     <w:qFormat/>
-    <w:rsid w:val="00CE097D"/>
+    <w:rsid w:val="003621E6"/>
     <w:pPr>
       <w:pBdr>
         <w:top w:val="single" w:sz="4" w:space="10" w:color="0F4761" w:themeColor="accent1" w:themeShade="BF"/>
@@ -913,7 +913,7 @@
     <w:basedOn w:val="DefaultParagraphFont"/>
     <w:link w:val="IntenseQuote"/>
     <w:uiPriority w:val="30"/>
-    <w:rsid w:val="00CE097D"/>
+    <w:rsid w:val="003621E6"/>
     <w:rPr>
       <w:i/>
       <w:iCs/>
@@ -925,7 +925,7 @@
     <w:basedOn w:val="DefaultParagraphFont"/>
     <w:uiPriority w:val="32"/>
     <w:qFormat/>
-    <w:rsid w:val="00CE097D"/>
+    <w:rsid w:val="003621E6"/>
     <w:rPr>
       <w:b/>
       <w:bCs/>

</xml_diff>

<commit_message>
Update samples and README - 2026-05-06 20:13 UTC
</commit_message>
<xml_diff>
--- a/samples/test_docx.docx
+++ b/samples/test_docx.docx
@@ -1,6 +1,6 @@
 
 <file path=word/document.xml><?xml version="1.0" encoding="utf-8"?>
-<w:document xmlns:wpc="http://schemas.microsoft.com/office/word/2010/wordprocessingCanvas" xmlns:cx="http://schemas.microsoft.com/office/drawing/2014/chartex" xmlns:cx1="http://schemas.microsoft.com/office/drawing/2015/9/8/chartex" xmlns:cx2="http://schemas.microsoft.com/office/drawing/2015/10/21/chartex" xmlns:cx3="http://schemas.microsoft.com/office/drawing/2016/5/9/chartex" xmlns:cx4="http://schemas.microsoft.com/office/drawing/2016/5/10/chartex" xmlns:cx5="http://schemas.microsoft.com/office/drawing/2016/5/11/chartex" xmlns:cx6="http://schemas.microsoft.com/office/drawing/2016/5/12/chartex" xmlns:cx7="http://schemas.microsoft.com/office/drawing/2016/5/13/chartex" xmlns:cx8="http://schemas.microsoft.com/office/drawing/2016/5/14/chartex" xmlns:mc="http://schemas.openxmlformats.org/markup-compatibility/2006" xmlns:aink="http://schemas.microsoft.com/office/drawing/2016/ink" xmlns:am3d="http://schemas.microsoft.com/office/drawing/2017/model3d" xmlns:o="urn:schemas-microsoft-com:office:office" xmlns:oel="http://schemas.microsoft.com/office/2019/extlst" xmlns:r="http://schemas.openxmlformats.org/officeDocument/2006/relationships" xmlns:m="http://schemas.openxmlformats.org/officeDocument/2006/math" xmlns:v="urn:schemas-microsoft-com:vml" xmlns:wp14="http://schemas.microsoft.com/office/word/2010/wordprocessingDrawing" xmlns:wp="http://schemas.openxmlformats.org/drawingml/2006/wordprocessingDrawing" xmlns:w10="urn:schemas-microsoft-com:office:word" xmlns:w="http://schemas.openxmlformats.org/wordprocessingml/2006/main" xmlns:w14="http://schemas.microsoft.com/office/word/2010/wordml" xmlns:w15="http://schemas.microsoft.com/office/word/2012/wordml" xmlns:w16cex="http://schemas.microsoft.com/office/word/2018/wordml/cex" xmlns:w16cid="http://schemas.microsoft.com/office/word/2016/wordml/cid" xmlns:w16="http://schemas.microsoft.com/office/word/2018/wordml" xmlns:w16du="http://schemas.microsoft.com/office/word/2023/wordml/word16du" xmlns:w16sdtdh="http://schemas.microsoft.com/office/word/2020/wordml/sdtdatahash" xmlns:w16sdtfl="http://schemas.microsoft.com/office/word/2024/wordml/sdtformatlock" xmlns:w16se="http://schemas.microsoft.com/office/word/2015/wordml/symex" xmlns:wpg="http://schemas.microsoft.com/office/word/2010/wordprocessingGroup" xmlns:wpi="http://schemas.microsoft.com/office/word/2010/wordprocessingInk" xmlns:wne="http://schemas.microsoft.com/office/word/2006/wordml" xmlns:wps="http://schemas.microsoft.com/office/word/2010/wordprocessingShape" mc:Ignorable="w14 w15 w16se w16cid w16 w16cex w16sdtdh w16sdtfl w16du wp14">
+<w:document xmlns:wpc="http://schemas.microsoft.com/office/word/2010/wordprocessingCanvas" xmlns:cx="http://schemas.microsoft.com/office/drawing/2014/chartex" xmlns:cx1="http://schemas.microsoft.com/office/drawing/2015/9/8/chartex" xmlns:cx2="http://schemas.microsoft.com/office/drawing/2015/10/21/chartex" xmlns:cx3="http://schemas.microsoft.com/office/drawing/2016/5/9/chartex" xmlns:cx4="http://schemas.microsoft.com/office/drawing/2016/5/10/chartex" xmlns:cx5="http://schemas.microsoft.com/office/drawing/2016/5/11/chartex" xmlns:cx6="http://schemas.microsoft.com/office/drawing/2016/5/12/chartex" xmlns:cx7="http://schemas.microsoft.com/office/drawing/2016/5/13/chartex" xmlns:cx8="http://schemas.microsoft.com/office/drawing/2016/5/14/chartex" xmlns:mc="http://schemas.openxmlformats.org/markup-compatibility/2006" xmlns:aink="http://schemas.microsoft.com/office/drawing/2016/ink" xmlns:am3d="http://schemas.microsoft.com/office/drawing/2017/model3d" xmlns:o="urn:schemas-microsoft-com:office:office" xmlns:oel="http://schemas.microsoft.com/office/2019/extlst" xmlns:r="http://schemas.openxmlformats.org/officeDocument/2006/relationships" xmlns:m="http://schemas.openxmlformats.org/officeDocument/2006/math" xmlns:v="urn:schemas-microsoft-com:vml" xmlns:wp14="http://schemas.microsoft.com/office/word/2010/wordprocessingDrawing" xmlns:wp="http://schemas.openxmlformats.org/drawingml/2006/wordprocessingDrawing" xmlns:w10="urn:schemas-microsoft-com:office:word" xmlns:w="http://schemas.openxmlformats.org/wordprocessingml/2006/main" xmlns:w14="http://schemas.microsoft.com/office/word/2010/wordml" xmlns:w15="http://schemas.microsoft.com/office/word/2012/wordml" xmlns:w16cex="http://schemas.microsoft.com/office/word/2018/wordml/cex" xmlns:w16cid="http://schemas.microsoft.com/office/word/2016/wordml/cid" xmlns:w16="http://schemas.microsoft.com/office/word/2018/wordml" xmlns:w16sdtdh="http://schemas.microsoft.com/office/word/2020/wordml/sdtdatahash" xmlns:w16se="http://schemas.microsoft.com/office/word/2015/wordml/symex" xmlns:wpg="http://schemas.microsoft.com/office/word/2010/wordprocessingGroup" xmlns:wpi="http://schemas.microsoft.com/office/word/2010/wordprocessingInk" xmlns:wne="http://schemas.microsoft.com/office/word/2006/wordml" xmlns:wps="http://schemas.microsoft.com/office/word/2010/wordprocessingShape" mc:Ignorable="w14 w15 w16se w16cid w16 w16cex w16sdtdh wp14">
   <w:body>
     <w:p>
       <w:r>
@@ -18,21 +18,19 @@
 </file>
 
 <file path=word/styles.xml><?xml version="1.0" encoding="utf-8"?>
-<w:styles xmlns:mc="http://schemas.openxmlformats.org/markup-compatibility/2006" xmlns:r="http://schemas.openxmlformats.org/officeDocument/2006/relationships" xmlns:w="http://schemas.openxmlformats.org/wordprocessingml/2006/main" xmlns:w14="http://schemas.microsoft.com/office/word/2010/wordml" xmlns:w15="http://schemas.microsoft.com/office/word/2012/wordml" xmlns:w16cex="http://schemas.microsoft.com/office/word/2018/wordml/cex" xmlns:w16cid="http://schemas.microsoft.com/office/word/2016/wordml/cid" xmlns:w16="http://schemas.microsoft.com/office/word/2018/wordml" xmlns:w16du="http://schemas.microsoft.com/office/word/2023/wordml/word16du" xmlns:w16sdtdh="http://schemas.microsoft.com/office/word/2020/wordml/sdtdatahash" xmlns:w16sdtfl="http://schemas.microsoft.com/office/word/2024/wordml/sdtformatlock" xmlns:w16se="http://schemas.microsoft.com/office/word/2015/wordml/symex" mc:Ignorable="w14 w15 w16se w16cid w16 w16cex w16sdtdh w16sdtfl w16du">
+<w:styles xmlns:mc="http://schemas.openxmlformats.org/markup-compatibility/2006" xmlns:r="http://schemas.openxmlformats.org/officeDocument/2006/relationships" xmlns:w="http://schemas.openxmlformats.org/wordprocessingml/2006/main" xmlns:w14="http://schemas.microsoft.com/office/word/2010/wordml" xmlns:w15="http://schemas.microsoft.com/office/word/2012/wordml" xmlns:w16cex="http://schemas.microsoft.com/office/word/2018/wordml/cex" xmlns:w16cid="http://schemas.microsoft.com/office/word/2016/wordml/cid" xmlns:w16="http://schemas.microsoft.com/office/word/2018/wordml" xmlns:w16sdtdh="http://schemas.microsoft.com/office/word/2020/wordml/sdtdatahash" xmlns:w16se="http://schemas.microsoft.com/office/word/2015/wordml/symex" mc:Ignorable="w14 w15 w16se w16cid w16 w16cex w16sdtdh">
   <w:docDefaults>
     <w:rPrDefault>
       <w:rPr>
         <w:rFonts w:asciiTheme="minorHAnsi" w:eastAsiaTheme="minorHAnsi" w:hAnsiTheme="minorHAnsi" w:cstheme="minorBidi"/>
-        <w:kern w:val="2"/>
-        <w:sz w:val="24"/>
-        <w:szCs w:val="24"/>
+        <w:sz w:val="22"/>
+        <w:szCs w:val="22"/>
         <w:lang w:val="en-US" w:eastAsia="en-US" w:bidi="ar-SA"/>
-        <w14:ligatures w14:val="standardContextual"/>
       </w:rPr>
     </w:rPrDefault>
     <w:pPrDefault>
       <w:pPr>
-        <w:spacing w:after="160" w:line="278" w:lineRule="auto"/>
+        <w:spacing w:after="160" w:line="259" w:lineRule="auto"/>
       </w:pPr>
     </w:pPrDefault>
   </w:docDefaults>
@@ -418,205 +416,6 @@
     <w:name w:val="Normal"/>
     <w:qFormat/>
   </w:style>
-  <w:style w:type="paragraph" w:styleId="Heading1">
-    <w:name w:val="heading 1"/>
-    <w:basedOn w:val="Normal"/>
-    <w:next w:val="Normal"/>
-    <w:link w:val="Heading1Char"/>
-    <w:uiPriority w:val="9"/>
-    <w:qFormat/>
-    <w:rsid w:val="003621E6"/>
-    <w:pPr>
-      <w:keepNext/>
-      <w:keepLines/>
-      <w:spacing w:before="360" w:after="80"/>
-      <w:outlineLvl w:val="0"/>
-    </w:pPr>
-    <w:rPr>
-      <w:rFonts w:asciiTheme="majorHAnsi" w:eastAsiaTheme="majorEastAsia" w:hAnsiTheme="majorHAnsi" w:cstheme="majorBidi"/>
-      <w:color w:val="0F4761" w:themeColor="accent1" w:themeShade="BF"/>
-      <w:sz w:val="40"/>
-      <w:szCs w:val="40"/>
-    </w:rPr>
-  </w:style>
-  <w:style w:type="paragraph" w:styleId="Heading2">
-    <w:name w:val="heading 2"/>
-    <w:basedOn w:val="Normal"/>
-    <w:next w:val="Normal"/>
-    <w:link w:val="Heading2Char"/>
-    <w:uiPriority w:val="9"/>
-    <w:semiHidden/>
-    <w:unhideWhenUsed/>
-    <w:qFormat/>
-    <w:rsid w:val="003621E6"/>
-    <w:pPr>
-      <w:keepNext/>
-      <w:keepLines/>
-      <w:spacing w:before="160" w:after="80"/>
-      <w:outlineLvl w:val="1"/>
-    </w:pPr>
-    <w:rPr>
-      <w:rFonts w:asciiTheme="majorHAnsi" w:eastAsiaTheme="majorEastAsia" w:hAnsiTheme="majorHAnsi" w:cstheme="majorBidi"/>
-      <w:color w:val="0F4761" w:themeColor="accent1" w:themeShade="BF"/>
-      <w:sz w:val="32"/>
-      <w:szCs w:val="32"/>
-    </w:rPr>
-  </w:style>
-  <w:style w:type="paragraph" w:styleId="Heading3">
-    <w:name w:val="heading 3"/>
-    <w:basedOn w:val="Normal"/>
-    <w:next w:val="Normal"/>
-    <w:link w:val="Heading3Char"/>
-    <w:uiPriority w:val="9"/>
-    <w:semiHidden/>
-    <w:unhideWhenUsed/>
-    <w:qFormat/>
-    <w:rsid w:val="003621E6"/>
-    <w:pPr>
-      <w:keepNext/>
-      <w:keepLines/>
-      <w:spacing w:before="160" w:after="80"/>
-      <w:outlineLvl w:val="2"/>
-    </w:pPr>
-    <w:rPr>
-      <w:rFonts w:eastAsiaTheme="majorEastAsia" w:cstheme="majorBidi"/>
-      <w:color w:val="0F4761" w:themeColor="accent1" w:themeShade="BF"/>
-      <w:sz w:val="28"/>
-      <w:szCs w:val="28"/>
-    </w:rPr>
-  </w:style>
-  <w:style w:type="paragraph" w:styleId="Heading4">
-    <w:name w:val="heading 4"/>
-    <w:basedOn w:val="Normal"/>
-    <w:next w:val="Normal"/>
-    <w:link w:val="Heading4Char"/>
-    <w:uiPriority w:val="9"/>
-    <w:semiHidden/>
-    <w:unhideWhenUsed/>
-    <w:qFormat/>
-    <w:rsid w:val="003621E6"/>
-    <w:pPr>
-      <w:keepNext/>
-      <w:keepLines/>
-      <w:spacing w:before="80" w:after="40"/>
-      <w:outlineLvl w:val="3"/>
-    </w:pPr>
-    <w:rPr>
-      <w:rFonts w:eastAsiaTheme="majorEastAsia" w:cstheme="majorBidi"/>
-      <w:i/>
-      <w:iCs/>
-      <w:color w:val="0F4761" w:themeColor="accent1" w:themeShade="BF"/>
-    </w:rPr>
-  </w:style>
-  <w:style w:type="paragraph" w:styleId="Heading5">
-    <w:name w:val="heading 5"/>
-    <w:basedOn w:val="Normal"/>
-    <w:next w:val="Normal"/>
-    <w:link w:val="Heading5Char"/>
-    <w:uiPriority w:val="9"/>
-    <w:semiHidden/>
-    <w:unhideWhenUsed/>
-    <w:qFormat/>
-    <w:rsid w:val="003621E6"/>
-    <w:pPr>
-      <w:keepNext/>
-      <w:keepLines/>
-      <w:spacing w:before="80" w:after="40"/>
-      <w:outlineLvl w:val="4"/>
-    </w:pPr>
-    <w:rPr>
-      <w:rFonts w:eastAsiaTheme="majorEastAsia" w:cstheme="majorBidi"/>
-      <w:color w:val="0F4761" w:themeColor="accent1" w:themeShade="BF"/>
-    </w:rPr>
-  </w:style>
-  <w:style w:type="paragraph" w:styleId="Heading6">
-    <w:name w:val="heading 6"/>
-    <w:basedOn w:val="Normal"/>
-    <w:next w:val="Normal"/>
-    <w:link w:val="Heading6Char"/>
-    <w:uiPriority w:val="9"/>
-    <w:semiHidden/>
-    <w:unhideWhenUsed/>
-    <w:qFormat/>
-    <w:rsid w:val="003621E6"/>
-    <w:pPr>
-      <w:keepNext/>
-      <w:keepLines/>
-      <w:spacing w:before="40" w:after="0"/>
-      <w:outlineLvl w:val="5"/>
-    </w:pPr>
-    <w:rPr>
-      <w:rFonts w:eastAsiaTheme="majorEastAsia" w:cstheme="majorBidi"/>
-      <w:i/>
-      <w:iCs/>
-      <w:color w:val="595959" w:themeColor="text1" w:themeTint="A6"/>
-    </w:rPr>
-  </w:style>
-  <w:style w:type="paragraph" w:styleId="Heading7">
-    <w:name w:val="heading 7"/>
-    <w:basedOn w:val="Normal"/>
-    <w:next w:val="Normal"/>
-    <w:link w:val="Heading7Char"/>
-    <w:uiPriority w:val="9"/>
-    <w:semiHidden/>
-    <w:unhideWhenUsed/>
-    <w:qFormat/>
-    <w:rsid w:val="003621E6"/>
-    <w:pPr>
-      <w:keepNext/>
-      <w:keepLines/>
-      <w:spacing w:before="40" w:after="0"/>
-      <w:outlineLvl w:val="6"/>
-    </w:pPr>
-    <w:rPr>
-      <w:rFonts w:eastAsiaTheme="majorEastAsia" w:cstheme="majorBidi"/>
-      <w:color w:val="595959" w:themeColor="text1" w:themeTint="A6"/>
-    </w:rPr>
-  </w:style>
-  <w:style w:type="paragraph" w:styleId="Heading8">
-    <w:name w:val="heading 8"/>
-    <w:basedOn w:val="Normal"/>
-    <w:next w:val="Normal"/>
-    <w:link w:val="Heading8Char"/>
-    <w:uiPriority w:val="9"/>
-    <w:semiHidden/>
-    <w:unhideWhenUsed/>
-    <w:qFormat/>
-    <w:rsid w:val="003621E6"/>
-    <w:pPr>
-      <w:keepNext/>
-      <w:keepLines/>
-      <w:spacing w:after="0"/>
-      <w:outlineLvl w:val="7"/>
-    </w:pPr>
-    <w:rPr>
-      <w:rFonts w:eastAsiaTheme="majorEastAsia" w:cstheme="majorBidi"/>
-      <w:i/>
-      <w:iCs/>
-      <w:color w:val="272727" w:themeColor="text1" w:themeTint="D8"/>
-    </w:rPr>
-  </w:style>
-  <w:style w:type="paragraph" w:styleId="Heading9">
-    <w:name w:val="heading 9"/>
-    <w:basedOn w:val="Normal"/>
-    <w:next w:val="Normal"/>
-    <w:link w:val="Heading9Char"/>
-    <w:uiPriority w:val="9"/>
-    <w:semiHidden/>
-    <w:unhideWhenUsed/>
-    <w:qFormat/>
-    <w:rsid w:val="003621E6"/>
-    <w:pPr>
-      <w:keepNext/>
-      <w:keepLines/>
-      <w:spacing w:after="0"/>
-      <w:outlineLvl w:val="8"/>
-    </w:pPr>
-    <w:rPr>
-      <w:rFonts w:eastAsiaTheme="majorEastAsia" w:cstheme="majorBidi"/>
-      <w:color w:val="272727" w:themeColor="text1" w:themeTint="D8"/>
-    </w:rPr>
-  </w:style>
   <w:style w:type="character" w:default="1" w:styleId="DefaultParagraphFont">
     <w:name w:val="Default Paragraph Font"/>
     <w:uiPriority w:val="1"/>
@@ -644,296 +443,6 @@
     <w:semiHidden/>
     <w:unhideWhenUsed/>
   </w:style>
-  <w:style w:type="character" w:customStyle="1" w:styleId="Heading1Char">
-    <w:name w:val="Heading 1 Char"/>
-    <w:basedOn w:val="DefaultParagraphFont"/>
-    <w:link w:val="Heading1"/>
-    <w:uiPriority w:val="9"/>
-    <w:rsid w:val="003621E6"/>
-    <w:rPr>
-      <w:rFonts w:asciiTheme="majorHAnsi" w:eastAsiaTheme="majorEastAsia" w:hAnsiTheme="majorHAnsi" w:cstheme="majorBidi"/>
-      <w:color w:val="0F4761" w:themeColor="accent1" w:themeShade="BF"/>
-      <w:sz w:val="40"/>
-      <w:szCs w:val="40"/>
-    </w:rPr>
-  </w:style>
-  <w:style w:type="character" w:customStyle="1" w:styleId="Heading2Char">
-    <w:name w:val="Heading 2 Char"/>
-    <w:basedOn w:val="DefaultParagraphFont"/>
-    <w:link w:val="Heading2"/>
-    <w:uiPriority w:val="9"/>
-    <w:semiHidden/>
-    <w:rsid w:val="003621E6"/>
-    <w:rPr>
-      <w:rFonts w:asciiTheme="majorHAnsi" w:eastAsiaTheme="majorEastAsia" w:hAnsiTheme="majorHAnsi" w:cstheme="majorBidi"/>
-      <w:color w:val="0F4761" w:themeColor="accent1" w:themeShade="BF"/>
-      <w:sz w:val="32"/>
-      <w:szCs w:val="32"/>
-    </w:rPr>
-  </w:style>
-  <w:style w:type="character" w:customStyle="1" w:styleId="Heading3Char">
-    <w:name w:val="Heading 3 Char"/>
-    <w:basedOn w:val="DefaultParagraphFont"/>
-    <w:link w:val="Heading3"/>
-    <w:uiPriority w:val="9"/>
-    <w:semiHidden/>
-    <w:rsid w:val="003621E6"/>
-    <w:rPr>
-      <w:rFonts w:eastAsiaTheme="majorEastAsia" w:cstheme="majorBidi"/>
-      <w:color w:val="0F4761" w:themeColor="accent1" w:themeShade="BF"/>
-      <w:sz w:val="28"/>
-      <w:szCs w:val="28"/>
-    </w:rPr>
-  </w:style>
-  <w:style w:type="character" w:customStyle="1" w:styleId="Heading4Char">
-    <w:name w:val="Heading 4 Char"/>
-    <w:basedOn w:val="DefaultParagraphFont"/>
-    <w:link w:val="Heading4"/>
-    <w:uiPriority w:val="9"/>
-    <w:semiHidden/>
-    <w:rsid w:val="003621E6"/>
-    <w:rPr>
-      <w:rFonts w:eastAsiaTheme="majorEastAsia" w:cstheme="majorBidi"/>
-      <w:i/>
-      <w:iCs/>
-      <w:color w:val="0F4761" w:themeColor="accent1" w:themeShade="BF"/>
-    </w:rPr>
-  </w:style>
-  <w:style w:type="character" w:customStyle="1" w:styleId="Heading5Char">
-    <w:name w:val="Heading 5 Char"/>
-    <w:basedOn w:val="DefaultParagraphFont"/>
-    <w:link w:val="Heading5"/>
-    <w:uiPriority w:val="9"/>
-    <w:semiHidden/>
-    <w:rsid w:val="003621E6"/>
-    <w:rPr>
-      <w:rFonts w:eastAsiaTheme="majorEastAsia" w:cstheme="majorBidi"/>
-      <w:color w:val="0F4761" w:themeColor="accent1" w:themeShade="BF"/>
-    </w:rPr>
-  </w:style>
-  <w:style w:type="character" w:customStyle="1" w:styleId="Heading6Char">
-    <w:name w:val="Heading 6 Char"/>
-    <w:basedOn w:val="DefaultParagraphFont"/>
-    <w:link w:val="Heading6"/>
-    <w:uiPriority w:val="9"/>
-    <w:semiHidden/>
-    <w:rsid w:val="003621E6"/>
-    <w:rPr>
-      <w:rFonts w:eastAsiaTheme="majorEastAsia" w:cstheme="majorBidi"/>
-      <w:i/>
-      <w:iCs/>
-      <w:color w:val="595959" w:themeColor="text1" w:themeTint="A6"/>
-    </w:rPr>
-  </w:style>
-  <w:style w:type="character" w:customStyle="1" w:styleId="Heading7Char">
-    <w:name w:val="Heading 7 Char"/>
-    <w:basedOn w:val="DefaultParagraphFont"/>
-    <w:link w:val="Heading7"/>
-    <w:uiPriority w:val="9"/>
-    <w:semiHidden/>
-    <w:rsid w:val="003621E6"/>
-    <w:rPr>
-      <w:rFonts w:eastAsiaTheme="majorEastAsia" w:cstheme="majorBidi"/>
-      <w:color w:val="595959" w:themeColor="text1" w:themeTint="A6"/>
-    </w:rPr>
-  </w:style>
-  <w:style w:type="character" w:customStyle="1" w:styleId="Heading8Char">
-    <w:name w:val="Heading 8 Char"/>
-    <w:basedOn w:val="DefaultParagraphFont"/>
-    <w:link w:val="Heading8"/>
-    <w:uiPriority w:val="9"/>
-    <w:semiHidden/>
-    <w:rsid w:val="003621E6"/>
-    <w:rPr>
-      <w:rFonts w:eastAsiaTheme="majorEastAsia" w:cstheme="majorBidi"/>
-      <w:i/>
-      <w:iCs/>
-      <w:color w:val="272727" w:themeColor="text1" w:themeTint="D8"/>
-    </w:rPr>
-  </w:style>
-  <w:style w:type="character" w:customStyle="1" w:styleId="Heading9Char">
-    <w:name w:val="Heading 9 Char"/>
-    <w:basedOn w:val="DefaultParagraphFont"/>
-    <w:link w:val="Heading9"/>
-    <w:uiPriority w:val="9"/>
-    <w:semiHidden/>
-    <w:rsid w:val="003621E6"/>
-    <w:rPr>
-      <w:rFonts w:eastAsiaTheme="majorEastAsia" w:cstheme="majorBidi"/>
-      <w:color w:val="272727" w:themeColor="text1" w:themeTint="D8"/>
-    </w:rPr>
-  </w:style>
-  <w:style w:type="paragraph" w:styleId="Title">
-    <w:name w:val="Title"/>
-    <w:basedOn w:val="Normal"/>
-    <w:next w:val="Normal"/>
-    <w:link w:val="TitleChar"/>
-    <w:uiPriority w:val="10"/>
-    <w:qFormat/>
-    <w:rsid w:val="003621E6"/>
-    <w:pPr>
-      <w:spacing w:after="80" w:line="240" w:lineRule="auto"/>
-      <w:contextualSpacing/>
-    </w:pPr>
-    <w:rPr>
-      <w:rFonts w:asciiTheme="majorHAnsi" w:eastAsiaTheme="majorEastAsia" w:hAnsiTheme="majorHAnsi" w:cstheme="majorBidi"/>
-      <w:spacing w:val="-10"/>
-      <w:kern w:val="28"/>
-      <w:sz w:val="56"/>
-      <w:szCs w:val="56"/>
-    </w:rPr>
-  </w:style>
-  <w:style w:type="character" w:customStyle="1" w:styleId="TitleChar">
-    <w:name w:val="Title Char"/>
-    <w:basedOn w:val="DefaultParagraphFont"/>
-    <w:link w:val="Title"/>
-    <w:uiPriority w:val="10"/>
-    <w:rsid w:val="003621E6"/>
-    <w:rPr>
-      <w:rFonts w:asciiTheme="majorHAnsi" w:eastAsiaTheme="majorEastAsia" w:hAnsiTheme="majorHAnsi" w:cstheme="majorBidi"/>
-      <w:spacing w:val="-10"/>
-      <w:kern w:val="28"/>
-      <w:sz w:val="56"/>
-      <w:szCs w:val="56"/>
-    </w:rPr>
-  </w:style>
-  <w:style w:type="paragraph" w:styleId="Subtitle">
-    <w:name w:val="Subtitle"/>
-    <w:basedOn w:val="Normal"/>
-    <w:next w:val="Normal"/>
-    <w:link w:val="SubtitleChar"/>
-    <w:uiPriority w:val="11"/>
-    <w:qFormat/>
-    <w:rsid w:val="003621E6"/>
-    <w:pPr>
-      <w:numPr>
-        <w:ilvl w:val="1"/>
-      </w:numPr>
-    </w:pPr>
-    <w:rPr>
-      <w:rFonts w:eastAsiaTheme="majorEastAsia" w:cstheme="majorBidi"/>
-      <w:color w:val="595959" w:themeColor="text1" w:themeTint="A6"/>
-      <w:spacing w:val="15"/>
-      <w:sz w:val="28"/>
-      <w:szCs w:val="28"/>
-    </w:rPr>
-  </w:style>
-  <w:style w:type="character" w:customStyle="1" w:styleId="SubtitleChar">
-    <w:name w:val="Subtitle Char"/>
-    <w:basedOn w:val="DefaultParagraphFont"/>
-    <w:link w:val="Subtitle"/>
-    <w:uiPriority w:val="11"/>
-    <w:rsid w:val="003621E6"/>
-    <w:rPr>
-      <w:rFonts w:eastAsiaTheme="majorEastAsia" w:cstheme="majorBidi"/>
-      <w:color w:val="595959" w:themeColor="text1" w:themeTint="A6"/>
-      <w:spacing w:val="15"/>
-      <w:sz w:val="28"/>
-      <w:szCs w:val="28"/>
-    </w:rPr>
-  </w:style>
-  <w:style w:type="paragraph" w:styleId="Quote">
-    <w:name w:val="Quote"/>
-    <w:basedOn w:val="Normal"/>
-    <w:next w:val="Normal"/>
-    <w:link w:val="QuoteChar"/>
-    <w:uiPriority w:val="29"/>
-    <w:qFormat/>
-    <w:rsid w:val="003621E6"/>
-    <w:pPr>
-      <w:spacing w:before="160"/>
-      <w:jc w:val="center"/>
-    </w:pPr>
-    <w:rPr>
-      <w:i/>
-      <w:iCs/>
-      <w:color w:val="404040" w:themeColor="text1" w:themeTint="BF"/>
-    </w:rPr>
-  </w:style>
-  <w:style w:type="character" w:customStyle="1" w:styleId="QuoteChar">
-    <w:name w:val="Quote Char"/>
-    <w:basedOn w:val="DefaultParagraphFont"/>
-    <w:link w:val="Quote"/>
-    <w:uiPriority w:val="29"/>
-    <w:rsid w:val="003621E6"/>
-    <w:rPr>
-      <w:i/>
-      <w:iCs/>
-      <w:color w:val="404040" w:themeColor="text1" w:themeTint="BF"/>
-    </w:rPr>
-  </w:style>
-  <w:style w:type="paragraph" w:styleId="ListParagraph">
-    <w:name w:val="List Paragraph"/>
-    <w:basedOn w:val="Normal"/>
-    <w:uiPriority w:val="34"/>
-    <w:qFormat/>
-    <w:rsid w:val="003621E6"/>
-    <w:pPr>
-      <w:ind w:left="720"/>
-      <w:contextualSpacing/>
-    </w:pPr>
-  </w:style>
-  <w:style w:type="character" w:styleId="IntenseEmphasis">
-    <w:name w:val="Intense Emphasis"/>
-    <w:basedOn w:val="DefaultParagraphFont"/>
-    <w:uiPriority w:val="21"/>
-    <w:qFormat/>
-    <w:rsid w:val="003621E6"/>
-    <w:rPr>
-      <w:i/>
-      <w:iCs/>
-      <w:color w:val="0F4761" w:themeColor="accent1" w:themeShade="BF"/>
-    </w:rPr>
-  </w:style>
-  <w:style w:type="paragraph" w:styleId="IntenseQuote">
-    <w:name w:val="Intense Quote"/>
-    <w:basedOn w:val="Normal"/>
-    <w:next w:val="Normal"/>
-    <w:link w:val="IntenseQuoteChar"/>
-    <w:uiPriority w:val="30"/>
-    <w:qFormat/>
-    <w:rsid w:val="003621E6"/>
-    <w:pPr>
-      <w:pBdr>
-        <w:top w:val="single" w:sz="4" w:space="10" w:color="0F4761" w:themeColor="accent1" w:themeShade="BF"/>
-        <w:bottom w:val="single" w:sz="4" w:space="10" w:color="0F4761" w:themeColor="accent1" w:themeShade="BF"/>
-      </w:pBdr>
-      <w:spacing w:before="360" w:after="360"/>
-      <w:ind w:left="864" w:right="864"/>
-      <w:jc w:val="center"/>
-    </w:pPr>
-    <w:rPr>
-      <w:i/>
-      <w:iCs/>
-      <w:color w:val="0F4761" w:themeColor="accent1" w:themeShade="BF"/>
-    </w:rPr>
-  </w:style>
-  <w:style w:type="character" w:customStyle="1" w:styleId="IntenseQuoteChar">
-    <w:name w:val="Intense Quote Char"/>
-    <w:basedOn w:val="DefaultParagraphFont"/>
-    <w:link w:val="IntenseQuote"/>
-    <w:uiPriority w:val="30"/>
-    <w:rsid w:val="003621E6"/>
-    <w:rPr>
-      <w:i/>
-      <w:iCs/>
-      <w:color w:val="0F4761" w:themeColor="accent1" w:themeShade="BF"/>
-    </w:rPr>
-  </w:style>
-  <w:style w:type="character" w:styleId="IntenseReference">
-    <w:name w:val="Intense Reference"/>
-    <w:basedOn w:val="DefaultParagraphFont"/>
-    <w:uiPriority w:val="32"/>
-    <w:qFormat/>
-    <w:rsid w:val="003621E6"/>
-    <w:rPr>
-      <w:b/>
-      <w:bCs/>
-      <w:smallCaps/>
-      <w:color w:val="0F4761" w:themeColor="accent1" w:themeShade="BF"/>
-      <w:spacing w:val="5"/>
-    </w:rPr>
-  </w:style>
 </w:styles>
 </file>
 
@@ -948,39 +457,39 @@
         <a:sysClr val="window" lastClr="FFFFFF"/>
       </a:lt1>
       <a:dk2>
-        <a:srgbClr val="0E2841"/>
+        <a:srgbClr val="44546A"/>
       </a:dk2>
       <a:lt2>
-        <a:srgbClr val="E8E8E8"/>
+        <a:srgbClr val="E7E6E6"/>
       </a:lt2>
       <a:accent1>
-        <a:srgbClr val="156082"/>
+        <a:srgbClr val="4472C4"/>
       </a:accent1>
       <a:accent2>
-        <a:srgbClr val="E97132"/>
+        <a:srgbClr val="ED7D31"/>
       </a:accent2>
       <a:accent3>
-        <a:srgbClr val="196B24"/>
+        <a:srgbClr val="A5A5A5"/>
       </a:accent3>
       <a:accent4>
-        <a:srgbClr val="0F9ED5"/>
+        <a:srgbClr val="FFC000"/>
       </a:accent4>
       <a:accent5>
-        <a:srgbClr val="A02B93"/>
+        <a:srgbClr val="5B9BD5"/>
       </a:accent5>
       <a:accent6>
-        <a:srgbClr val="4EA72E"/>
+        <a:srgbClr val="70AD47"/>
       </a:accent6>
       <a:hlink>
-        <a:srgbClr val="467886"/>
+        <a:srgbClr val="0563C1"/>
       </a:hlink>
       <a:folHlink>
-        <a:srgbClr val="96607D"/>
+        <a:srgbClr val="954F72"/>
       </a:folHlink>
     </a:clrScheme>
     <a:fontScheme name="Office">
       <a:majorFont>
-        <a:latin typeface="Aptos Display" panose="02110004020202020204"/>
+        <a:latin typeface="Calibri Light" panose="020F0302020204030204"/>
         <a:ea typeface=""/>
         <a:cs typeface=""/>
         <a:font script="Jpan" typeface="游ゴシック Light"/>
@@ -1032,7 +541,7 @@
         <a:font script="Tfng" typeface="Ebrima"/>
       </a:majorFont>
       <a:minorFont>
-        <a:latin typeface="Aptos" panose="02110004020202020204"/>
+        <a:latin typeface="Calibri" panose="020F0502020204030204"/>
         <a:ea typeface=""/>
         <a:cs typeface=""/>
         <a:font script="Jpan" typeface="游明朝"/>
@@ -1143,6 +652,13 @@
         </a:gradFill>
       </a:fillStyleLst>
       <a:lnStyleLst>
+        <a:ln w="6350" cap="flat" cmpd="sng" algn="ctr">
+          <a:solidFill>
+            <a:schemeClr val="phClr"/>
+          </a:solidFill>
+          <a:prstDash val="solid"/>
+          <a:miter lim="800000"/>
+        </a:ln>
         <a:ln w="12700" cap="flat" cmpd="sng" algn="ctr">
           <a:solidFill>
             <a:schemeClr val="phClr"/>
@@ -1151,13 +667,6 @@
           <a:miter lim="800000"/>
         </a:ln>
         <a:ln w="19050" cap="flat" cmpd="sng" algn="ctr">
-          <a:solidFill>
-            <a:schemeClr val="phClr"/>
-          </a:solidFill>
-          <a:prstDash val="solid"/>
-          <a:miter lim="800000"/>
-        </a:ln>
-        <a:ln w="25400" cap="flat" cmpd="sng" algn="ctr">
           <a:solidFill>
             <a:schemeClr val="phClr"/>
           </a:solidFill>
@@ -1222,31 +731,11 @@
       </a:bgFillStyleLst>
     </a:fmtScheme>
   </a:themeElements>
-  <a:objectDefaults>
-    <a:lnDef>
-      <a:spPr/>
-      <a:bodyPr/>
-      <a:lstStyle/>
-      <a:style>
-        <a:lnRef idx="2">
-          <a:schemeClr val="accent1"/>
-        </a:lnRef>
-        <a:fillRef idx="0">
-          <a:schemeClr val="accent1"/>
-        </a:fillRef>
-        <a:effectRef idx="1">
-          <a:schemeClr val="accent1"/>
-        </a:effectRef>
-        <a:fontRef idx="minor">
-          <a:schemeClr val="tx1"/>
-        </a:fontRef>
-      </a:style>
-    </a:lnDef>
-  </a:objectDefaults>
+  <a:objectDefaults/>
   <a:extraClrSchemeLst/>
   <a:extLst>
     <a:ext uri="{05A4C25C-085E-4340-85A3-A5531E510DB2}">
-      <thm15:themeFamily xmlns:thm15="http://schemas.microsoft.com/office/thememl/2012/main" name="Office Theme" id="{2E142A2C-CD16-42D6-873A-C26D2A0506FA}" vid="{1BDDFF52-6CD6-40A5-AB3C-68EB2F1E4D0A}"/>
+      <thm15:themeFamily xmlns:thm15="http://schemas.microsoft.com/office/thememl/2012/main" name="Office Theme" id="{62F939B6-93AF-4DB8-9C6B-D6C7DFDC589F}" vid="{4A3C46E8-61CC-4603-A589-7422A47A8E4A}"/>
     </a:ext>
   </a:extLst>
 </a:theme>

</xml_diff>

<commit_message>
Update samples and README - 2026-06-06 09:25 UTC
</commit_message>
<xml_diff>
--- a/samples/test_docx.docx
+++ b/samples/test_docx.docx
@@ -1,6 +1,6 @@
 
 <file path=word/document.xml><?xml version="1.0" encoding="utf-8"?>
-<w:document xmlns:wpc="http://schemas.microsoft.com/office/word/2010/wordprocessingCanvas" xmlns:cx="http://schemas.microsoft.com/office/drawing/2014/chartex" xmlns:cx1="http://schemas.microsoft.com/office/drawing/2015/9/8/chartex" xmlns:cx2="http://schemas.microsoft.com/office/drawing/2015/10/21/chartex" xmlns:cx3="http://schemas.microsoft.com/office/drawing/2016/5/9/chartex" xmlns:cx4="http://schemas.microsoft.com/office/drawing/2016/5/10/chartex" xmlns:cx5="http://schemas.microsoft.com/office/drawing/2016/5/11/chartex" xmlns:cx6="http://schemas.microsoft.com/office/drawing/2016/5/12/chartex" xmlns:cx7="http://schemas.microsoft.com/office/drawing/2016/5/13/chartex" xmlns:cx8="http://schemas.microsoft.com/office/drawing/2016/5/14/chartex" xmlns:mc="http://schemas.openxmlformats.org/markup-compatibility/2006" xmlns:aink="http://schemas.microsoft.com/office/drawing/2016/ink" xmlns:am3d="http://schemas.microsoft.com/office/drawing/2017/model3d" xmlns:o="urn:schemas-microsoft-com:office:office" xmlns:oel="http://schemas.microsoft.com/office/2019/extlst" xmlns:r="http://schemas.openxmlformats.org/officeDocument/2006/relationships" xmlns:m="http://schemas.openxmlformats.org/officeDocument/2006/math" xmlns:v="urn:schemas-microsoft-com:vml" xmlns:wp14="http://schemas.microsoft.com/office/word/2010/wordprocessingDrawing" xmlns:wp="http://schemas.openxmlformats.org/drawingml/2006/wordprocessingDrawing" xmlns:w10="urn:schemas-microsoft-com:office:word" xmlns:w="http://schemas.openxmlformats.org/wordprocessingml/2006/main" xmlns:w14="http://schemas.microsoft.com/office/word/2010/wordml" xmlns:w15="http://schemas.microsoft.com/office/word/2012/wordml" xmlns:w16cex="http://schemas.microsoft.com/office/word/2018/wordml/cex" xmlns:w16cid="http://schemas.microsoft.com/office/word/2016/wordml/cid" xmlns:w16="http://schemas.microsoft.com/office/word/2018/wordml" xmlns:w16sdtdh="http://schemas.microsoft.com/office/word/2020/wordml/sdtdatahash" xmlns:w16se="http://schemas.microsoft.com/office/word/2015/wordml/symex" xmlns:wpg="http://schemas.microsoft.com/office/word/2010/wordprocessingGroup" xmlns:wpi="http://schemas.microsoft.com/office/word/2010/wordprocessingInk" xmlns:wne="http://schemas.microsoft.com/office/word/2006/wordml" xmlns:wps="http://schemas.microsoft.com/office/word/2010/wordprocessingShape" mc:Ignorable="w14 w15 w16se w16cid w16 w16cex w16sdtdh wp14">
+<w:document xmlns:wpc="http://schemas.microsoft.com/office/word/2010/wordprocessingCanvas" xmlns:cx="http://schemas.microsoft.com/office/drawing/2014/chartex" xmlns:cx1="http://schemas.microsoft.com/office/drawing/2015/9/8/chartex" xmlns:cx2="http://schemas.microsoft.com/office/drawing/2015/10/21/chartex" xmlns:cx3="http://schemas.microsoft.com/office/drawing/2016/5/9/chartex" xmlns:cx4="http://schemas.microsoft.com/office/drawing/2016/5/10/chartex" xmlns:cx5="http://schemas.microsoft.com/office/drawing/2016/5/11/chartex" xmlns:cx6="http://schemas.microsoft.com/office/drawing/2016/5/12/chartex" xmlns:cx7="http://schemas.microsoft.com/office/drawing/2016/5/13/chartex" xmlns:cx8="http://schemas.microsoft.com/office/drawing/2016/5/14/chartex" xmlns:mc="http://schemas.openxmlformats.org/markup-compatibility/2006" xmlns:aink="http://schemas.microsoft.com/office/drawing/2016/ink" xmlns:am3d="http://schemas.microsoft.com/office/drawing/2017/model3d" xmlns:o="urn:schemas-microsoft-com:office:office" xmlns:oel="http://schemas.microsoft.com/office/2019/extlst" xmlns:r="http://schemas.openxmlformats.org/officeDocument/2006/relationships" xmlns:m="http://schemas.openxmlformats.org/officeDocument/2006/math" xmlns:v="urn:schemas-microsoft-com:vml" xmlns:wp14="http://schemas.microsoft.com/office/word/2010/wordprocessingDrawing" xmlns:wp="http://schemas.openxmlformats.org/drawingml/2006/wordprocessingDrawing" xmlns:w10="urn:schemas-microsoft-com:office:word" xmlns:w="http://schemas.openxmlformats.org/wordprocessingml/2006/main" xmlns:w14="http://schemas.microsoft.com/office/word/2010/wordml" xmlns:w15="http://schemas.microsoft.com/office/word/2012/wordml" xmlns:w16cex="http://schemas.microsoft.com/office/word/2018/wordml/cex" xmlns:w16cid="http://schemas.microsoft.com/office/word/2016/wordml/cid" xmlns:w16="http://schemas.microsoft.com/office/word/2018/wordml" xmlns:w16du="http://schemas.microsoft.com/office/word/2023/wordml/word16du" xmlns:w16sdtdh="http://schemas.microsoft.com/office/word/2020/wordml/sdtdatahash" xmlns:w16sdtfl="http://schemas.microsoft.com/office/word/2024/wordml/sdtformatlock" xmlns:w16se="http://schemas.microsoft.com/office/word/2015/wordml/symex" xmlns:wpg="http://schemas.microsoft.com/office/word/2010/wordprocessingGroup" xmlns:wpi="http://schemas.microsoft.com/office/word/2010/wordprocessingInk" xmlns:wne="http://schemas.microsoft.com/office/word/2006/wordml" xmlns:wps="http://schemas.microsoft.com/office/word/2010/wordprocessingShape" mc:Ignorable="w14 w15 w16se w16cid w16 w16cex w16sdtdh w16sdtfl w16du wp14">
   <w:body>
     <w:p>
       <w:r>
@@ -18,19 +18,21 @@
 </file>
 
 <file path=word/styles.xml><?xml version="1.0" encoding="utf-8"?>
-<w:styles xmlns:mc="http://schemas.openxmlformats.org/markup-compatibility/2006" xmlns:r="http://schemas.openxmlformats.org/officeDocument/2006/relationships" xmlns:w="http://schemas.openxmlformats.org/wordprocessingml/2006/main" xmlns:w14="http://schemas.microsoft.com/office/word/2010/wordml" xmlns:w15="http://schemas.microsoft.com/office/word/2012/wordml" xmlns:w16cex="http://schemas.microsoft.com/office/word/2018/wordml/cex" xmlns:w16cid="http://schemas.microsoft.com/office/word/2016/wordml/cid" xmlns:w16="http://schemas.microsoft.com/office/word/2018/wordml" xmlns:w16sdtdh="http://schemas.microsoft.com/office/word/2020/wordml/sdtdatahash" xmlns:w16se="http://schemas.microsoft.com/office/word/2015/wordml/symex" mc:Ignorable="w14 w15 w16se w16cid w16 w16cex w16sdtdh">
+<w:styles xmlns:mc="http://schemas.openxmlformats.org/markup-compatibility/2006" xmlns:r="http://schemas.openxmlformats.org/officeDocument/2006/relationships" xmlns:w="http://schemas.openxmlformats.org/wordprocessingml/2006/main" xmlns:w14="http://schemas.microsoft.com/office/word/2010/wordml" xmlns:w15="http://schemas.microsoft.com/office/word/2012/wordml" xmlns:w16cex="http://schemas.microsoft.com/office/word/2018/wordml/cex" xmlns:w16cid="http://schemas.microsoft.com/office/word/2016/wordml/cid" xmlns:w16="http://schemas.microsoft.com/office/word/2018/wordml" xmlns:w16du="http://schemas.microsoft.com/office/word/2023/wordml/word16du" xmlns:w16sdtdh="http://schemas.microsoft.com/office/word/2020/wordml/sdtdatahash" xmlns:w16sdtfl="http://schemas.microsoft.com/office/word/2024/wordml/sdtformatlock" xmlns:w16se="http://schemas.microsoft.com/office/word/2015/wordml/symex" mc:Ignorable="w14 w15 w16se w16cid w16 w16cex w16sdtdh w16sdtfl w16du">
   <w:docDefaults>
     <w:rPrDefault>
       <w:rPr>
         <w:rFonts w:asciiTheme="minorHAnsi" w:eastAsiaTheme="minorHAnsi" w:hAnsiTheme="minorHAnsi" w:cstheme="minorBidi"/>
-        <w:sz w:val="22"/>
-        <w:szCs w:val="22"/>
+        <w:kern w:val="2"/>
+        <w:sz w:val="24"/>
+        <w:szCs w:val="24"/>
         <w:lang w:val="en-US" w:eastAsia="en-US" w:bidi="ar-SA"/>
+        <w14:ligatures w14:val="standardContextual"/>
       </w:rPr>
     </w:rPrDefault>
     <w:pPrDefault>
       <w:pPr>
-        <w:spacing w:after="160" w:line="259" w:lineRule="auto"/>
+        <w:spacing w:after="160" w:line="278" w:lineRule="auto"/>
       </w:pPr>
     </w:pPrDefault>
   </w:docDefaults>
@@ -416,6 +418,205 @@
     <w:name w:val="Normal"/>
     <w:qFormat/>
   </w:style>
+  <w:style w:type="paragraph" w:styleId="Heading1">
+    <w:name w:val="heading 1"/>
+    <w:basedOn w:val="Normal"/>
+    <w:next w:val="Normal"/>
+    <w:link w:val="Heading1Char"/>
+    <w:uiPriority w:val="9"/>
+    <w:qFormat/>
+    <w:rsid w:val="00E25C6D"/>
+    <w:pPr>
+      <w:keepNext/>
+      <w:keepLines/>
+      <w:spacing w:before="360" w:after="80"/>
+      <w:outlineLvl w:val="0"/>
+    </w:pPr>
+    <w:rPr>
+      <w:rFonts w:asciiTheme="majorHAnsi" w:eastAsiaTheme="majorEastAsia" w:hAnsiTheme="majorHAnsi" w:cstheme="majorBidi"/>
+      <w:color w:val="0F4761" w:themeColor="accent1" w:themeShade="BF"/>
+      <w:sz w:val="40"/>
+      <w:szCs w:val="40"/>
+    </w:rPr>
+  </w:style>
+  <w:style w:type="paragraph" w:styleId="Heading2">
+    <w:name w:val="heading 2"/>
+    <w:basedOn w:val="Normal"/>
+    <w:next w:val="Normal"/>
+    <w:link w:val="Heading2Char"/>
+    <w:uiPriority w:val="9"/>
+    <w:semiHidden/>
+    <w:unhideWhenUsed/>
+    <w:qFormat/>
+    <w:rsid w:val="00E25C6D"/>
+    <w:pPr>
+      <w:keepNext/>
+      <w:keepLines/>
+      <w:spacing w:before="160" w:after="80"/>
+      <w:outlineLvl w:val="1"/>
+    </w:pPr>
+    <w:rPr>
+      <w:rFonts w:asciiTheme="majorHAnsi" w:eastAsiaTheme="majorEastAsia" w:hAnsiTheme="majorHAnsi" w:cstheme="majorBidi"/>
+      <w:color w:val="0F4761" w:themeColor="accent1" w:themeShade="BF"/>
+      <w:sz w:val="32"/>
+      <w:szCs w:val="32"/>
+    </w:rPr>
+  </w:style>
+  <w:style w:type="paragraph" w:styleId="Heading3">
+    <w:name w:val="heading 3"/>
+    <w:basedOn w:val="Normal"/>
+    <w:next w:val="Normal"/>
+    <w:link w:val="Heading3Char"/>
+    <w:uiPriority w:val="9"/>
+    <w:semiHidden/>
+    <w:unhideWhenUsed/>
+    <w:qFormat/>
+    <w:rsid w:val="00E25C6D"/>
+    <w:pPr>
+      <w:keepNext/>
+      <w:keepLines/>
+      <w:spacing w:before="160" w:after="80"/>
+      <w:outlineLvl w:val="2"/>
+    </w:pPr>
+    <w:rPr>
+      <w:rFonts w:eastAsiaTheme="majorEastAsia" w:cstheme="majorBidi"/>
+      <w:color w:val="0F4761" w:themeColor="accent1" w:themeShade="BF"/>
+      <w:sz w:val="28"/>
+      <w:szCs w:val="28"/>
+    </w:rPr>
+  </w:style>
+  <w:style w:type="paragraph" w:styleId="Heading4">
+    <w:name w:val="heading 4"/>
+    <w:basedOn w:val="Normal"/>
+    <w:next w:val="Normal"/>
+    <w:link w:val="Heading4Char"/>
+    <w:uiPriority w:val="9"/>
+    <w:semiHidden/>
+    <w:unhideWhenUsed/>
+    <w:qFormat/>
+    <w:rsid w:val="00E25C6D"/>
+    <w:pPr>
+      <w:keepNext/>
+      <w:keepLines/>
+      <w:spacing w:before="80" w:after="40"/>
+      <w:outlineLvl w:val="3"/>
+    </w:pPr>
+    <w:rPr>
+      <w:rFonts w:eastAsiaTheme="majorEastAsia" w:cstheme="majorBidi"/>
+      <w:i/>
+      <w:iCs/>
+      <w:color w:val="0F4761" w:themeColor="accent1" w:themeShade="BF"/>
+    </w:rPr>
+  </w:style>
+  <w:style w:type="paragraph" w:styleId="Heading5">
+    <w:name w:val="heading 5"/>
+    <w:basedOn w:val="Normal"/>
+    <w:next w:val="Normal"/>
+    <w:link w:val="Heading5Char"/>
+    <w:uiPriority w:val="9"/>
+    <w:semiHidden/>
+    <w:unhideWhenUsed/>
+    <w:qFormat/>
+    <w:rsid w:val="00E25C6D"/>
+    <w:pPr>
+      <w:keepNext/>
+      <w:keepLines/>
+      <w:spacing w:before="80" w:after="40"/>
+      <w:outlineLvl w:val="4"/>
+    </w:pPr>
+    <w:rPr>
+      <w:rFonts w:eastAsiaTheme="majorEastAsia" w:cstheme="majorBidi"/>
+      <w:color w:val="0F4761" w:themeColor="accent1" w:themeShade="BF"/>
+    </w:rPr>
+  </w:style>
+  <w:style w:type="paragraph" w:styleId="Heading6">
+    <w:name w:val="heading 6"/>
+    <w:basedOn w:val="Normal"/>
+    <w:next w:val="Normal"/>
+    <w:link w:val="Heading6Char"/>
+    <w:uiPriority w:val="9"/>
+    <w:semiHidden/>
+    <w:unhideWhenUsed/>
+    <w:qFormat/>
+    <w:rsid w:val="00E25C6D"/>
+    <w:pPr>
+      <w:keepNext/>
+      <w:keepLines/>
+      <w:spacing w:before="40" w:after="0"/>
+      <w:outlineLvl w:val="5"/>
+    </w:pPr>
+    <w:rPr>
+      <w:rFonts w:eastAsiaTheme="majorEastAsia" w:cstheme="majorBidi"/>
+      <w:i/>
+      <w:iCs/>
+      <w:color w:val="595959" w:themeColor="text1" w:themeTint="A6"/>
+    </w:rPr>
+  </w:style>
+  <w:style w:type="paragraph" w:styleId="Heading7">
+    <w:name w:val="heading 7"/>
+    <w:basedOn w:val="Normal"/>
+    <w:next w:val="Normal"/>
+    <w:link w:val="Heading7Char"/>
+    <w:uiPriority w:val="9"/>
+    <w:semiHidden/>
+    <w:unhideWhenUsed/>
+    <w:qFormat/>
+    <w:rsid w:val="00E25C6D"/>
+    <w:pPr>
+      <w:keepNext/>
+      <w:keepLines/>
+      <w:spacing w:before="40" w:after="0"/>
+      <w:outlineLvl w:val="6"/>
+    </w:pPr>
+    <w:rPr>
+      <w:rFonts w:eastAsiaTheme="majorEastAsia" w:cstheme="majorBidi"/>
+      <w:color w:val="595959" w:themeColor="text1" w:themeTint="A6"/>
+    </w:rPr>
+  </w:style>
+  <w:style w:type="paragraph" w:styleId="Heading8">
+    <w:name w:val="heading 8"/>
+    <w:basedOn w:val="Normal"/>
+    <w:next w:val="Normal"/>
+    <w:link w:val="Heading8Char"/>
+    <w:uiPriority w:val="9"/>
+    <w:semiHidden/>
+    <w:unhideWhenUsed/>
+    <w:qFormat/>
+    <w:rsid w:val="00E25C6D"/>
+    <w:pPr>
+      <w:keepNext/>
+      <w:keepLines/>
+      <w:spacing w:after="0"/>
+      <w:outlineLvl w:val="7"/>
+    </w:pPr>
+    <w:rPr>
+      <w:rFonts w:eastAsiaTheme="majorEastAsia" w:cstheme="majorBidi"/>
+      <w:i/>
+      <w:iCs/>
+      <w:color w:val="272727" w:themeColor="text1" w:themeTint="D8"/>
+    </w:rPr>
+  </w:style>
+  <w:style w:type="paragraph" w:styleId="Heading9">
+    <w:name w:val="heading 9"/>
+    <w:basedOn w:val="Normal"/>
+    <w:next w:val="Normal"/>
+    <w:link w:val="Heading9Char"/>
+    <w:uiPriority w:val="9"/>
+    <w:semiHidden/>
+    <w:unhideWhenUsed/>
+    <w:qFormat/>
+    <w:rsid w:val="00E25C6D"/>
+    <w:pPr>
+      <w:keepNext/>
+      <w:keepLines/>
+      <w:spacing w:after="0"/>
+      <w:outlineLvl w:val="8"/>
+    </w:pPr>
+    <w:rPr>
+      <w:rFonts w:eastAsiaTheme="majorEastAsia" w:cstheme="majorBidi"/>
+      <w:color w:val="272727" w:themeColor="text1" w:themeTint="D8"/>
+    </w:rPr>
+  </w:style>
   <w:style w:type="character" w:default="1" w:styleId="DefaultParagraphFont">
     <w:name w:val="Default Paragraph Font"/>
     <w:uiPriority w:val="1"/>
@@ -442,6 +643,296 @@
     <w:uiPriority w:val="99"/>
     <w:semiHidden/>
     <w:unhideWhenUsed/>
+  </w:style>
+  <w:style w:type="character" w:customStyle="1" w:styleId="Heading1Char">
+    <w:name w:val="Heading 1 Char"/>
+    <w:basedOn w:val="DefaultParagraphFont"/>
+    <w:link w:val="Heading1"/>
+    <w:uiPriority w:val="9"/>
+    <w:rsid w:val="00E25C6D"/>
+    <w:rPr>
+      <w:rFonts w:asciiTheme="majorHAnsi" w:eastAsiaTheme="majorEastAsia" w:hAnsiTheme="majorHAnsi" w:cstheme="majorBidi"/>
+      <w:color w:val="0F4761" w:themeColor="accent1" w:themeShade="BF"/>
+      <w:sz w:val="40"/>
+      <w:szCs w:val="40"/>
+    </w:rPr>
+  </w:style>
+  <w:style w:type="character" w:customStyle="1" w:styleId="Heading2Char">
+    <w:name w:val="Heading 2 Char"/>
+    <w:basedOn w:val="DefaultParagraphFont"/>
+    <w:link w:val="Heading2"/>
+    <w:uiPriority w:val="9"/>
+    <w:semiHidden/>
+    <w:rsid w:val="00E25C6D"/>
+    <w:rPr>
+      <w:rFonts w:asciiTheme="majorHAnsi" w:eastAsiaTheme="majorEastAsia" w:hAnsiTheme="majorHAnsi" w:cstheme="majorBidi"/>
+      <w:color w:val="0F4761" w:themeColor="accent1" w:themeShade="BF"/>
+      <w:sz w:val="32"/>
+      <w:szCs w:val="32"/>
+    </w:rPr>
+  </w:style>
+  <w:style w:type="character" w:customStyle="1" w:styleId="Heading3Char">
+    <w:name w:val="Heading 3 Char"/>
+    <w:basedOn w:val="DefaultParagraphFont"/>
+    <w:link w:val="Heading3"/>
+    <w:uiPriority w:val="9"/>
+    <w:semiHidden/>
+    <w:rsid w:val="00E25C6D"/>
+    <w:rPr>
+      <w:rFonts w:eastAsiaTheme="majorEastAsia" w:cstheme="majorBidi"/>
+      <w:color w:val="0F4761" w:themeColor="accent1" w:themeShade="BF"/>
+      <w:sz w:val="28"/>
+      <w:szCs w:val="28"/>
+    </w:rPr>
+  </w:style>
+  <w:style w:type="character" w:customStyle="1" w:styleId="Heading4Char">
+    <w:name w:val="Heading 4 Char"/>
+    <w:basedOn w:val="DefaultParagraphFont"/>
+    <w:link w:val="Heading4"/>
+    <w:uiPriority w:val="9"/>
+    <w:semiHidden/>
+    <w:rsid w:val="00E25C6D"/>
+    <w:rPr>
+      <w:rFonts w:eastAsiaTheme="majorEastAsia" w:cstheme="majorBidi"/>
+      <w:i/>
+      <w:iCs/>
+      <w:color w:val="0F4761" w:themeColor="accent1" w:themeShade="BF"/>
+    </w:rPr>
+  </w:style>
+  <w:style w:type="character" w:customStyle="1" w:styleId="Heading5Char">
+    <w:name w:val="Heading 5 Char"/>
+    <w:basedOn w:val="DefaultParagraphFont"/>
+    <w:link w:val="Heading5"/>
+    <w:uiPriority w:val="9"/>
+    <w:semiHidden/>
+    <w:rsid w:val="00E25C6D"/>
+    <w:rPr>
+      <w:rFonts w:eastAsiaTheme="majorEastAsia" w:cstheme="majorBidi"/>
+      <w:color w:val="0F4761" w:themeColor="accent1" w:themeShade="BF"/>
+    </w:rPr>
+  </w:style>
+  <w:style w:type="character" w:customStyle="1" w:styleId="Heading6Char">
+    <w:name w:val="Heading 6 Char"/>
+    <w:basedOn w:val="DefaultParagraphFont"/>
+    <w:link w:val="Heading6"/>
+    <w:uiPriority w:val="9"/>
+    <w:semiHidden/>
+    <w:rsid w:val="00E25C6D"/>
+    <w:rPr>
+      <w:rFonts w:eastAsiaTheme="majorEastAsia" w:cstheme="majorBidi"/>
+      <w:i/>
+      <w:iCs/>
+      <w:color w:val="595959" w:themeColor="text1" w:themeTint="A6"/>
+    </w:rPr>
+  </w:style>
+  <w:style w:type="character" w:customStyle="1" w:styleId="Heading7Char">
+    <w:name w:val="Heading 7 Char"/>
+    <w:basedOn w:val="DefaultParagraphFont"/>
+    <w:link w:val="Heading7"/>
+    <w:uiPriority w:val="9"/>
+    <w:semiHidden/>
+    <w:rsid w:val="00E25C6D"/>
+    <w:rPr>
+      <w:rFonts w:eastAsiaTheme="majorEastAsia" w:cstheme="majorBidi"/>
+      <w:color w:val="595959" w:themeColor="text1" w:themeTint="A6"/>
+    </w:rPr>
+  </w:style>
+  <w:style w:type="character" w:customStyle="1" w:styleId="Heading8Char">
+    <w:name w:val="Heading 8 Char"/>
+    <w:basedOn w:val="DefaultParagraphFont"/>
+    <w:link w:val="Heading8"/>
+    <w:uiPriority w:val="9"/>
+    <w:semiHidden/>
+    <w:rsid w:val="00E25C6D"/>
+    <w:rPr>
+      <w:rFonts w:eastAsiaTheme="majorEastAsia" w:cstheme="majorBidi"/>
+      <w:i/>
+      <w:iCs/>
+      <w:color w:val="272727" w:themeColor="text1" w:themeTint="D8"/>
+    </w:rPr>
+  </w:style>
+  <w:style w:type="character" w:customStyle="1" w:styleId="Heading9Char">
+    <w:name w:val="Heading 9 Char"/>
+    <w:basedOn w:val="DefaultParagraphFont"/>
+    <w:link w:val="Heading9"/>
+    <w:uiPriority w:val="9"/>
+    <w:semiHidden/>
+    <w:rsid w:val="00E25C6D"/>
+    <w:rPr>
+      <w:rFonts w:eastAsiaTheme="majorEastAsia" w:cstheme="majorBidi"/>
+      <w:color w:val="272727" w:themeColor="text1" w:themeTint="D8"/>
+    </w:rPr>
+  </w:style>
+  <w:style w:type="paragraph" w:styleId="Title">
+    <w:name w:val="Title"/>
+    <w:basedOn w:val="Normal"/>
+    <w:next w:val="Normal"/>
+    <w:link w:val="TitleChar"/>
+    <w:uiPriority w:val="10"/>
+    <w:qFormat/>
+    <w:rsid w:val="00E25C6D"/>
+    <w:pPr>
+      <w:spacing w:after="80" w:line="240" w:lineRule="auto"/>
+      <w:contextualSpacing/>
+    </w:pPr>
+    <w:rPr>
+      <w:rFonts w:asciiTheme="majorHAnsi" w:eastAsiaTheme="majorEastAsia" w:hAnsiTheme="majorHAnsi" w:cstheme="majorBidi"/>
+      <w:spacing w:val="-10"/>
+      <w:kern w:val="28"/>
+      <w:sz w:val="56"/>
+      <w:szCs w:val="56"/>
+    </w:rPr>
+  </w:style>
+  <w:style w:type="character" w:customStyle="1" w:styleId="TitleChar">
+    <w:name w:val="Title Char"/>
+    <w:basedOn w:val="DefaultParagraphFont"/>
+    <w:link w:val="Title"/>
+    <w:uiPriority w:val="10"/>
+    <w:rsid w:val="00E25C6D"/>
+    <w:rPr>
+      <w:rFonts w:asciiTheme="majorHAnsi" w:eastAsiaTheme="majorEastAsia" w:hAnsiTheme="majorHAnsi" w:cstheme="majorBidi"/>
+      <w:spacing w:val="-10"/>
+      <w:kern w:val="28"/>
+      <w:sz w:val="56"/>
+      <w:szCs w:val="56"/>
+    </w:rPr>
+  </w:style>
+  <w:style w:type="paragraph" w:styleId="Subtitle">
+    <w:name w:val="Subtitle"/>
+    <w:basedOn w:val="Normal"/>
+    <w:next w:val="Normal"/>
+    <w:link w:val="SubtitleChar"/>
+    <w:uiPriority w:val="11"/>
+    <w:qFormat/>
+    <w:rsid w:val="00E25C6D"/>
+    <w:pPr>
+      <w:numPr>
+        <w:ilvl w:val="1"/>
+      </w:numPr>
+    </w:pPr>
+    <w:rPr>
+      <w:rFonts w:eastAsiaTheme="majorEastAsia" w:cstheme="majorBidi"/>
+      <w:color w:val="595959" w:themeColor="text1" w:themeTint="A6"/>
+      <w:spacing w:val="15"/>
+      <w:sz w:val="28"/>
+      <w:szCs w:val="28"/>
+    </w:rPr>
+  </w:style>
+  <w:style w:type="character" w:customStyle="1" w:styleId="SubtitleChar">
+    <w:name w:val="Subtitle Char"/>
+    <w:basedOn w:val="DefaultParagraphFont"/>
+    <w:link w:val="Subtitle"/>
+    <w:uiPriority w:val="11"/>
+    <w:rsid w:val="00E25C6D"/>
+    <w:rPr>
+      <w:rFonts w:eastAsiaTheme="majorEastAsia" w:cstheme="majorBidi"/>
+      <w:color w:val="595959" w:themeColor="text1" w:themeTint="A6"/>
+      <w:spacing w:val="15"/>
+      <w:sz w:val="28"/>
+      <w:szCs w:val="28"/>
+    </w:rPr>
+  </w:style>
+  <w:style w:type="paragraph" w:styleId="Quote">
+    <w:name w:val="Quote"/>
+    <w:basedOn w:val="Normal"/>
+    <w:next w:val="Normal"/>
+    <w:link w:val="QuoteChar"/>
+    <w:uiPriority w:val="29"/>
+    <w:qFormat/>
+    <w:rsid w:val="00E25C6D"/>
+    <w:pPr>
+      <w:spacing w:before="160"/>
+      <w:jc w:val="center"/>
+    </w:pPr>
+    <w:rPr>
+      <w:i/>
+      <w:iCs/>
+      <w:color w:val="404040" w:themeColor="text1" w:themeTint="BF"/>
+    </w:rPr>
+  </w:style>
+  <w:style w:type="character" w:customStyle="1" w:styleId="QuoteChar">
+    <w:name w:val="Quote Char"/>
+    <w:basedOn w:val="DefaultParagraphFont"/>
+    <w:link w:val="Quote"/>
+    <w:uiPriority w:val="29"/>
+    <w:rsid w:val="00E25C6D"/>
+    <w:rPr>
+      <w:i/>
+      <w:iCs/>
+      <w:color w:val="404040" w:themeColor="text1" w:themeTint="BF"/>
+    </w:rPr>
+  </w:style>
+  <w:style w:type="paragraph" w:styleId="ListParagraph">
+    <w:name w:val="List Paragraph"/>
+    <w:basedOn w:val="Normal"/>
+    <w:uiPriority w:val="34"/>
+    <w:qFormat/>
+    <w:rsid w:val="00E25C6D"/>
+    <w:pPr>
+      <w:ind w:left="720"/>
+      <w:contextualSpacing/>
+    </w:pPr>
+  </w:style>
+  <w:style w:type="character" w:styleId="IntenseEmphasis">
+    <w:name w:val="Intense Emphasis"/>
+    <w:basedOn w:val="DefaultParagraphFont"/>
+    <w:uiPriority w:val="21"/>
+    <w:qFormat/>
+    <w:rsid w:val="00E25C6D"/>
+    <w:rPr>
+      <w:i/>
+      <w:iCs/>
+      <w:color w:val="0F4761" w:themeColor="accent1" w:themeShade="BF"/>
+    </w:rPr>
+  </w:style>
+  <w:style w:type="paragraph" w:styleId="IntenseQuote">
+    <w:name w:val="Intense Quote"/>
+    <w:basedOn w:val="Normal"/>
+    <w:next w:val="Normal"/>
+    <w:link w:val="IntenseQuoteChar"/>
+    <w:uiPriority w:val="30"/>
+    <w:qFormat/>
+    <w:rsid w:val="00E25C6D"/>
+    <w:pPr>
+      <w:pBdr>
+        <w:top w:val="single" w:sz="4" w:space="10" w:color="0F4761" w:themeColor="accent1" w:themeShade="BF"/>
+        <w:bottom w:val="single" w:sz="4" w:space="10" w:color="0F4761" w:themeColor="accent1" w:themeShade="BF"/>
+      </w:pBdr>
+      <w:spacing w:before="360" w:after="360"/>
+      <w:ind w:left="864" w:right="864"/>
+      <w:jc w:val="center"/>
+    </w:pPr>
+    <w:rPr>
+      <w:i/>
+      <w:iCs/>
+      <w:color w:val="0F4761" w:themeColor="accent1" w:themeShade="BF"/>
+    </w:rPr>
+  </w:style>
+  <w:style w:type="character" w:customStyle="1" w:styleId="IntenseQuoteChar">
+    <w:name w:val="Intense Quote Char"/>
+    <w:basedOn w:val="DefaultParagraphFont"/>
+    <w:link w:val="IntenseQuote"/>
+    <w:uiPriority w:val="30"/>
+    <w:rsid w:val="00E25C6D"/>
+    <w:rPr>
+      <w:i/>
+      <w:iCs/>
+      <w:color w:val="0F4761" w:themeColor="accent1" w:themeShade="BF"/>
+    </w:rPr>
+  </w:style>
+  <w:style w:type="character" w:styleId="IntenseReference">
+    <w:name w:val="Intense Reference"/>
+    <w:basedOn w:val="DefaultParagraphFont"/>
+    <w:uiPriority w:val="32"/>
+    <w:qFormat/>
+    <w:rsid w:val="00E25C6D"/>
+    <w:rPr>
+      <w:b/>
+      <w:bCs/>
+      <w:smallCaps/>
+      <w:color w:val="0F4761" w:themeColor="accent1" w:themeShade="BF"/>
+      <w:spacing w:val="5"/>
+    </w:rPr>
   </w:style>
 </w:styles>
 </file>
@@ -457,39 +948,39 @@
         <a:sysClr val="window" lastClr="FFFFFF"/>
       </a:lt1>
       <a:dk2>
-        <a:srgbClr val="44546A"/>
+        <a:srgbClr val="0E2841"/>
       </a:dk2>
       <a:lt2>
-        <a:srgbClr val="E7E6E6"/>
+        <a:srgbClr val="E8E8E8"/>
       </a:lt2>
       <a:accent1>
-        <a:srgbClr val="4472C4"/>
+        <a:srgbClr val="156082"/>
       </a:accent1>
       <a:accent2>
-        <a:srgbClr val="ED7D31"/>
+        <a:srgbClr val="E97132"/>
       </a:accent2>
       <a:accent3>
-        <a:srgbClr val="A5A5A5"/>
+        <a:srgbClr val="196B24"/>
       </a:accent3>
       <a:accent4>
-        <a:srgbClr val="FFC000"/>
+        <a:srgbClr val="0F9ED5"/>
       </a:accent4>
       <a:accent5>
-        <a:srgbClr val="5B9BD5"/>
+        <a:srgbClr val="A02B93"/>
       </a:accent5>
       <a:accent6>
-        <a:srgbClr val="70AD47"/>
+        <a:srgbClr val="4EA72E"/>
       </a:accent6>
       <a:hlink>
-        <a:srgbClr val="0563C1"/>
+        <a:srgbClr val="467886"/>
       </a:hlink>
       <a:folHlink>
-        <a:srgbClr val="954F72"/>
+        <a:srgbClr val="96607D"/>
       </a:folHlink>
     </a:clrScheme>
     <a:fontScheme name="Office">
       <a:majorFont>
-        <a:latin typeface="Calibri Light" panose="020F0302020204030204"/>
+        <a:latin typeface="Aptos Display" panose="02110004020202020204"/>
         <a:ea typeface=""/>
         <a:cs typeface=""/>
         <a:font script="Jpan" typeface="游ゴシック Light"/>
@@ -541,7 +1032,7 @@
         <a:font script="Tfng" typeface="Ebrima"/>
       </a:majorFont>
       <a:minorFont>
-        <a:latin typeface="Calibri" panose="020F0502020204030204"/>
+        <a:latin typeface="Aptos" panose="02110004020202020204"/>
         <a:ea typeface=""/>
         <a:cs typeface=""/>
         <a:font script="Jpan" typeface="游明朝"/>
@@ -652,13 +1143,6 @@
         </a:gradFill>
       </a:fillStyleLst>
       <a:lnStyleLst>
-        <a:ln w="6350" cap="flat" cmpd="sng" algn="ctr">
-          <a:solidFill>
-            <a:schemeClr val="phClr"/>
-          </a:solidFill>
-          <a:prstDash val="solid"/>
-          <a:miter lim="800000"/>
-        </a:ln>
         <a:ln w="12700" cap="flat" cmpd="sng" algn="ctr">
           <a:solidFill>
             <a:schemeClr val="phClr"/>
@@ -667,6 +1151,13 @@
           <a:miter lim="800000"/>
         </a:ln>
         <a:ln w="19050" cap="flat" cmpd="sng" algn="ctr">
+          <a:solidFill>
+            <a:schemeClr val="phClr"/>
+          </a:solidFill>
+          <a:prstDash val="solid"/>
+          <a:miter lim="800000"/>
+        </a:ln>
+        <a:ln w="25400" cap="flat" cmpd="sng" algn="ctr">
           <a:solidFill>
             <a:schemeClr val="phClr"/>
           </a:solidFill>
@@ -731,11 +1222,31 @@
       </a:bgFillStyleLst>
     </a:fmtScheme>
   </a:themeElements>
-  <a:objectDefaults/>
+  <a:objectDefaults>
+    <a:lnDef>
+      <a:spPr/>
+      <a:bodyPr/>
+      <a:lstStyle/>
+      <a:style>
+        <a:lnRef idx="2">
+          <a:schemeClr val="accent1"/>
+        </a:lnRef>
+        <a:fillRef idx="0">
+          <a:schemeClr val="accent1"/>
+        </a:fillRef>
+        <a:effectRef idx="1">
+          <a:schemeClr val="accent1"/>
+        </a:effectRef>
+        <a:fontRef idx="minor">
+          <a:schemeClr val="tx1"/>
+        </a:fontRef>
+      </a:style>
+    </a:lnDef>
+  </a:objectDefaults>
   <a:extraClrSchemeLst/>
   <a:extLst>
     <a:ext uri="{05A4C25C-085E-4340-85A3-A5531E510DB2}">
-      <thm15:themeFamily xmlns:thm15="http://schemas.microsoft.com/office/thememl/2012/main" name="Office Theme" id="{62F939B6-93AF-4DB8-9C6B-D6C7DFDC589F}" vid="{4A3C46E8-61CC-4603-A589-7422A47A8E4A}"/>
+      <thm15:themeFamily xmlns:thm15="http://schemas.microsoft.com/office/thememl/2012/main" name="Office Theme" id="{2E142A2C-CD16-42D6-873A-C26D2A0506FA}" vid="{1BDDFF52-6CD6-40A5-AB3C-68EB2F1E4D0A}"/>
     </a:ext>
   </a:extLst>
 </a:theme>

</xml_diff>